<commit_message>
Add meeting notes for April 15 and update Resum document; enhance Dijkstra example with multiple graph scenarios
Co-authored-by: Copilot <copilot@github.com>
</commit_message>
<xml_diff>
--- a/.meetings/Resum.docx
+++ b/.meetings/Resum.docx
@@ -16,7 +16,23 @@
           <w:sz w:val="24"/>
           <w:szCs w:val="24"/>
         </w:rPr>
-        <w:t>30/09 Explicació idea inicial</w:t>
+        <w:t>09</w:t>
+      </w:r>
+      <w:r>
+        <w:rPr>
+          <w:rFonts w:ascii="Arial" w:hAnsi="Arial" w:cs="Arial"/>
+          <w:sz w:val="24"/>
+          <w:szCs w:val="24"/>
+        </w:rPr>
+        <w:t>.30</w:t>
+      </w:r>
+      <w:r>
+        <w:rPr>
+          <w:rFonts w:ascii="Arial" w:hAnsi="Arial" w:cs="Arial"/>
+          <w:sz w:val="24"/>
+          <w:szCs w:val="24"/>
+        </w:rPr>
+        <w:t xml:space="preserve"> Explicació idea inicial</w:t>
       </w:r>
     </w:p>
     <w:p>
@@ -33,8 +49,34 @@
           <w:sz w:val="24"/>
           <w:szCs w:val="24"/>
         </w:rPr>
-        <w:t>09/10 Mostra dades trobades a gtfs</w:t>
-      </w:r>
+        <w:t>10</w:t>
+      </w:r>
+      <w:r>
+        <w:rPr>
+          <w:rFonts w:ascii="Arial" w:hAnsi="Arial" w:cs="Arial"/>
+          <w:sz w:val="24"/>
+          <w:szCs w:val="24"/>
+        </w:rPr>
+        <w:t>.09</w:t>
+      </w:r>
+      <w:r>
+        <w:rPr>
+          <w:rFonts w:ascii="Arial" w:hAnsi="Arial" w:cs="Arial"/>
+          <w:sz w:val="24"/>
+          <w:szCs w:val="24"/>
+        </w:rPr>
+        <w:t xml:space="preserve"> Mostra dades trobades a </w:t>
+      </w:r>
+      <w:proofErr w:type="spellStart"/>
+      <w:r>
+        <w:rPr>
+          <w:rFonts w:ascii="Arial" w:hAnsi="Arial" w:cs="Arial"/>
+          <w:sz w:val="24"/>
+          <w:szCs w:val="24"/>
+        </w:rPr>
+        <w:t>gtfs</w:t>
+      </w:r>
+      <w:proofErr w:type="spellEnd"/>
     </w:p>
     <w:p>
       <w:pPr>
@@ -50,7 +92,41 @@
           <w:sz w:val="24"/>
           <w:szCs w:val="24"/>
         </w:rPr>
-        <w:t>06/02 Posar-nos al dia, redefinició de l’objectiu...</w:t>
+        <w:t>02</w:t>
+      </w:r>
+      <w:r>
+        <w:rPr>
+          <w:rFonts w:ascii="Arial" w:hAnsi="Arial" w:cs="Arial"/>
+          <w:sz w:val="24"/>
+          <w:szCs w:val="24"/>
+        </w:rPr>
+        <w:t>.06</w:t>
+      </w:r>
+      <w:r>
+        <w:rPr>
+          <w:rFonts w:ascii="Arial" w:hAnsi="Arial" w:cs="Arial"/>
+          <w:sz w:val="24"/>
+          <w:szCs w:val="24"/>
+        </w:rPr>
+        <w:t xml:space="preserve"> Posar-nos al dia, </w:t>
+      </w:r>
+      <w:proofErr w:type="spellStart"/>
+      <w:r>
+        <w:rPr>
+          <w:rFonts w:ascii="Arial" w:hAnsi="Arial" w:cs="Arial"/>
+          <w:sz w:val="24"/>
+          <w:szCs w:val="24"/>
+        </w:rPr>
+        <w:t>redefinició</w:t>
+      </w:r>
+      <w:proofErr w:type="spellEnd"/>
+      <w:r>
+        <w:rPr>
+          <w:rFonts w:ascii="Arial" w:hAnsi="Arial" w:cs="Arial"/>
+          <w:sz w:val="24"/>
+          <w:szCs w:val="24"/>
+        </w:rPr>
+        <w:t xml:space="preserve"> de l’objectiu...</w:t>
       </w:r>
     </w:p>
     <w:p>
@@ -67,7 +143,23 @@
           <w:sz w:val="24"/>
           <w:szCs w:val="24"/>
         </w:rPr>
-        <w:t xml:space="preserve">19/02 </w:t>
+        <w:t>02</w:t>
+      </w:r>
+      <w:r>
+        <w:rPr>
+          <w:rFonts w:ascii="Arial" w:hAnsi="Arial" w:cs="Arial"/>
+          <w:sz w:val="24"/>
+          <w:szCs w:val="24"/>
+        </w:rPr>
+        <w:t>.19</w:t>
+      </w:r>
+      <w:r>
+        <w:rPr>
+          <w:rFonts w:ascii="Arial" w:hAnsi="Arial" w:cs="Arial"/>
+          <w:sz w:val="24"/>
+          <w:szCs w:val="24"/>
+        </w:rPr>
+        <w:t xml:space="preserve"> </w:t>
       </w:r>
       <w:r>
         <w:rPr>
@@ -77,6 +169,130 @@
         </w:rPr>
         <w:t>Mostra de comprovacions de la qualitat de les dades, alguna idea per això...</w:t>
       </w:r>
+    </w:p>
+    <w:p>
+      <w:pPr>
+        <w:rPr>
+          <w:rFonts w:ascii="Arial" w:hAnsi="Arial" w:cs="Arial"/>
+          <w:sz w:val="24"/>
+          <w:szCs w:val="24"/>
+        </w:rPr>
+      </w:pPr>
+      <w:r>
+        <w:rPr>
+          <w:rFonts w:ascii="Arial" w:hAnsi="Arial" w:cs="Arial"/>
+          <w:sz w:val="24"/>
+          <w:szCs w:val="24"/>
+        </w:rPr>
+        <w:t xml:space="preserve">03.05 Data </w:t>
+      </w:r>
+      <w:proofErr w:type="spellStart"/>
+      <w:r>
+        <w:rPr>
+          <w:rFonts w:ascii="Arial" w:hAnsi="Arial" w:cs="Arial"/>
+          <w:sz w:val="24"/>
+          <w:szCs w:val="24"/>
+        </w:rPr>
+        <w:t>comprovations</w:t>
+      </w:r>
+      <w:proofErr w:type="spellEnd"/>
+    </w:p>
+    <w:p>
+      <w:pPr>
+        <w:rPr>
+          <w:rFonts w:ascii="Arial" w:hAnsi="Arial" w:cs="Arial"/>
+          <w:sz w:val="24"/>
+          <w:szCs w:val="24"/>
+        </w:rPr>
+      </w:pPr>
+      <w:r>
+        <w:rPr>
+          <w:rFonts w:ascii="Arial" w:hAnsi="Arial" w:cs="Arial"/>
+          <w:sz w:val="24"/>
+          <w:szCs w:val="24"/>
+        </w:rPr>
+        <w:t xml:space="preserve">03.19 Data </w:t>
+      </w:r>
+      <w:proofErr w:type="spellStart"/>
+      <w:r>
+        <w:rPr>
+          <w:rFonts w:ascii="Arial" w:hAnsi="Arial" w:cs="Arial"/>
+          <w:sz w:val="24"/>
+          <w:szCs w:val="24"/>
+        </w:rPr>
+        <w:t>comprovations</w:t>
+      </w:r>
+      <w:proofErr w:type="spellEnd"/>
+      <w:r>
+        <w:rPr>
+          <w:rFonts w:ascii="Arial" w:hAnsi="Arial" w:cs="Arial"/>
+          <w:sz w:val="24"/>
+          <w:szCs w:val="24"/>
+        </w:rPr>
+        <w:t xml:space="preserve"> </w:t>
+      </w:r>
+    </w:p>
+    <w:p>
+      <w:pPr>
+        <w:rPr>
+          <w:rFonts w:ascii="Arial" w:hAnsi="Arial" w:cs="Arial"/>
+          <w:sz w:val="24"/>
+          <w:szCs w:val="24"/>
+        </w:rPr>
+      </w:pPr>
+      <w:r>
+        <w:rPr>
+          <w:rFonts w:ascii="Arial" w:hAnsi="Arial" w:cs="Arial"/>
+          <w:sz w:val="24"/>
+          <w:szCs w:val="24"/>
+        </w:rPr>
+        <w:t xml:space="preserve">04.15 Comprovacions de dades acabades, exemple </w:t>
+      </w:r>
+      <w:proofErr w:type="spellStart"/>
+      <w:r>
+        <w:rPr>
+          <w:rFonts w:ascii="Arial" w:hAnsi="Arial" w:cs="Arial"/>
+          <w:sz w:val="24"/>
+          <w:szCs w:val="24"/>
+        </w:rPr>
+        <w:t>Dijkstra</w:t>
+      </w:r>
+      <w:proofErr w:type="spellEnd"/>
+      <w:r>
+        <w:rPr>
+          <w:rFonts w:ascii="Arial" w:hAnsi="Arial" w:cs="Arial"/>
+          <w:sz w:val="24"/>
+          <w:szCs w:val="24"/>
+        </w:rPr>
+        <w:t xml:space="preserve"> programat, definicions llibre i dubtes, estructura </w:t>
+      </w:r>
+      <w:proofErr w:type="spellStart"/>
+      <w:r>
+        <w:rPr>
+          <w:rFonts w:ascii="Arial" w:hAnsi="Arial" w:cs="Arial"/>
+          <w:sz w:val="24"/>
+          <w:szCs w:val="24"/>
+        </w:rPr>
+        <w:t>repositori</w:t>
+      </w:r>
+      <w:proofErr w:type="spellEnd"/>
+      <w:r>
+        <w:rPr>
+          <w:rFonts w:ascii="Arial" w:hAnsi="Arial" w:cs="Arial"/>
+          <w:sz w:val="24"/>
+          <w:szCs w:val="24"/>
+        </w:rPr>
+        <w:t xml:space="preserve"> millorada...</w:t>
+      </w:r>
+    </w:p>
+    <w:p>
+      <w:pPr>
+        <w:rPr>
+          <w:rFonts w:ascii="Arial" w:hAnsi="Arial" w:cs="Arial"/>
+          <w:sz w:val="24"/>
+          <w:szCs w:val="24"/>
+        </w:rPr>
+      </w:pPr>
     </w:p>
     <w:sectPr>
       <w:pgSz w:w="11906" w:h="16838"/>

</xml_diff>

<commit_message>
Remove later_schedule-case from tracking
</commit_message>
<xml_diff>
--- a/.meetings/Resum.docx
+++ b/.meetings/Resum.docx
@@ -283,6 +283,23 @@
           <w:szCs w:val="24"/>
         </w:rPr>
         <w:t xml:space="preserve"> millorada...</w:t>
+      </w:r>
+    </w:p>
+    <w:p>
+      <w:pPr>
+        <w:rPr>
+          <w:rFonts w:ascii="Arial" w:hAnsi="Arial" w:cs="Arial"/>
+          <w:sz w:val="24"/>
+          <w:szCs w:val="24"/>
+        </w:rPr>
+      </w:pPr>
+      <w:r>
+        <w:rPr>
+          <w:rFonts w:ascii="Arial" w:hAnsi="Arial" w:cs="Arial"/>
+          <w:sz w:val="24"/>
+          <w:szCs w:val="24"/>
+        </w:rPr>
+        <w:t xml:space="preserve">05.05 </w:t>
       </w:r>
     </w:p>
     <w:p>

</xml_diff>

<commit_message>
Update meeting notes in Resum document
</commit_message>
<xml_diff>
--- a/.meetings/Resum.docx
+++ b/.meetings/Resum.docx
@@ -65,18 +65,8 @@
           <w:sz w:val="24"/>
           <w:szCs w:val="24"/>
         </w:rPr>
-        <w:t xml:space="preserve"> Mostra dades trobades a </w:t>
-      </w:r>
-      <w:proofErr w:type="spellStart"/>
-      <w:r>
-        <w:rPr>
-          <w:rFonts w:ascii="Arial" w:hAnsi="Arial" w:cs="Arial"/>
-          <w:sz w:val="24"/>
-          <w:szCs w:val="24"/>
-        </w:rPr>
-        <w:t>gtfs</w:t>
-      </w:r>
-      <w:proofErr w:type="spellEnd"/>
+        <w:t xml:space="preserve"> Mostra dades trobades a gtfs</w:t>
+      </w:r>
     </w:p>
     <w:p>
       <w:pPr>
@@ -108,25 +98,7 @@
           <w:sz w:val="24"/>
           <w:szCs w:val="24"/>
         </w:rPr>
-        <w:t xml:space="preserve"> Posar-nos al dia, </w:t>
-      </w:r>
-      <w:proofErr w:type="spellStart"/>
-      <w:r>
-        <w:rPr>
-          <w:rFonts w:ascii="Arial" w:hAnsi="Arial" w:cs="Arial"/>
-          <w:sz w:val="24"/>
-          <w:szCs w:val="24"/>
-        </w:rPr>
-        <w:t>redefinició</w:t>
-      </w:r>
-      <w:proofErr w:type="spellEnd"/>
-      <w:r>
-        <w:rPr>
-          <w:rFonts w:ascii="Arial" w:hAnsi="Arial" w:cs="Arial"/>
-          <w:sz w:val="24"/>
-          <w:szCs w:val="24"/>
-        </w:rPr>
-        <w:t xml:space="preserve"> de l’objectiu...</w:t>
+        <w:t xml:space="preserve"> Posar-nos al dia, redefinició de l’objectiu...</w:t>
       </w:r>
     </w:p>
     <w:p>
@@ -184,18 +156,8 @@
           <w:sz w:val="24"/>
           <w:szCs w:val="24"/>
         </w:rPr>
-        <w:t xml:space="preserve">03.05 Data </w:t>
-      </w:r>
-      <w:proofErr w:type="spellStart"/>
-      <w:r>
-        <w:rPr>
-          <w:rFonts w:ascii="Arial" w:hAnsi="Arial" w:cs="Arial"/>
-          <w:sz w:val="24"/>
-          <w:szCs w:val="24"/>
-        </w:rPr>
-        <w:t>comprovations</w:t>
-      </w:r>
-      <w:proofErr w:type="spellEnd"/>
+        <w:t>03.05 Data comprovations</w:t>
+      </w:r>
     </w:p>
     <w:p>
       <w:pPr>
@@ -211,25 +173,7 @@
           <w:sz w:val="24"/>
           <w:szCs w:val="24"/>
         </w:rPr>
-        <w:t xml:space="preserve">03.19 Data </w:t>
-      </w:r>
-      <w:proofErr w:type="spellStart"/>
-      <w:r>
-        <w:rPr>
-          <w:rFonts w:ascii="Arial" w:hAnsi="Arial" w:cs="Arial"/>
-          <w:sz w:val="24"/>
-          <w:szCs w:val="24"/>
-        </w:rPr>
-        <w:t>comprovations</w:t>
-      </w:r>
-      <w:proofErr w:type="spellEnd"/>
-      <w:r>
-        <w:rPr>
-          <w:rFonts w:ascii="Arial" w:hAnsi="Arial" w:cs="Arial"/>
-          <w:sz w:val="24"/>
-          <w:szCs w:val="24"/>
-        </w:rPr>
-        <w:t xml:space="preserve"> </w:t>
+        <w:t xml:space="preserve">03.19 Data comprovations </w:t>
       </w:r>
     </w:p>
     <w:p>
@@ -246,43 +190,7 @@
           <w:sz w:val="24"/>
           <w:szCs w:val="24"/>
         </w:rPr>
-        <w:t xml:space="preserve">04.15 Comprovacions de dades acabades, exemple </w:t>
-      </w:r>
-      <w:proofErr w:type="spellStart"/>
-      <w:r>
-        <w:rPr>
-          <w:rFonts w:ascii="Arial" w:hAnsi="Arial" w:cs="Arial"/>
-          <w:sz w:val="24"/>
-          <w:szCs w:val="24"/>
-        </w:rPr>
-        <w:t>Dijkstra</w:t>
-      </w:r>
-      <w:proofErr w:type="spellEnd"/>
-      <w:r>
-        <w:rPr>
-          <w:rFonts w:ascii="Arial" w:hAnsi="Arial" w:cs="Arial"/>
-          <w:sz w:val="24"/>
-          <w:szCs w:val="24"/>
-        </w:rPr>
-        <w:t xml:space="preserve"> programat, definicions llibre i dubtes, estructura </w:t>
-      </w:r>
-      <w:proofErr w:type="spellStart"/>
-      <w:r>
-        <w:rPr>
-          <w:rFonts w:ascii="Arial" w:hAnsi="Arial" w:cs="Arial"/>
-          <w:sz w:val="24"/>
-          <w:szCs w:val="24"/>
-        </w:rPr>
-        <w:t>repositori</w:t>
-      </w:r>
-      <w:proofErr w:type="spellEnd"/>
-      <w:r>
-        <w:rPr>
-          <w:rFonts w:ascii="Arial" w:hAnsi="Arial" w:cs="Arial"/>
-          <w:sz w:val="24"/>
-          <w:szCs w:val="24"/>
-        </w:rPr>
-        <w:t xml:space="preserve"> millorada...</w:t>
+        <w:t>04.15 Comprovacions de dades acabades, exemple Dijkstra programat, definicions llibre i dubtes, estructura repositori millorada...</w:t>
       </w:r>
     </w:p>
     <w:p>
@@ -300,6 +208,14 @@
           <w:szCs w:val="24"/>
         </w:rPr>
         <w:t xml:space="preserve">05.05 </w:t>
+      </w:r>
+      <w:r>
+        <w:rPr>
+          <w:rFonts w:ascii="Arial" w:hAnsi="Arial" w:cs="Arial"/>
+          <w:sz w:val="24"/>
+          <w:szCs w:val="24"/>
+        </w:rPr>
+        <w:t>NEEDED TO COMPLETE</w:t>
       </w:r>
     </w:p>
     <w:p>

</xml_diff>

<commit_message>
Add GTFS cleaning pipeline and reorganize data references
Created a new cleaning module with clear sequential steps:
1_subway: extracts subway-only GTFS files from the original data.
2_trips_to_eliminate: removes duplicated trip IDs from stop_times and trips.
3_stop_sequence: prepares stop sequence cleaning logic.
4_terminal_stops: prepares terminal stop cleaning logic.
5_L9_L10_data_duplication: prepares L9/L10 duplication handling.

Reorganized GTFS data folders to separate original files, subway extracts, and duplicated-trip cleaning outputs.
Fixed references to .txt files across validation scripts, notebooks, and GTFS utilities so they point to the new folder structure.
Updated pre-commit validation fixes for docstrings, local variable placement, and requirements checking.
</commit_message>
<xml_diff>
--- a/.meetings/Resum.docx
+++ b/.meetings/Resum.docx
@@ -351,6 +351,23 @@
           <w:szCs w:val="24"/>
         </w:rPr>
         <w:t>Cas Liceu i necessitat d’un graf dirigit</w:t>
+      </w:r>
+    </w:p>
+    <w:p>
+      <w:pPr>
+        <w:rPr>
+          <w:rFonts w:ascii="Arial" w:hAnsi="Arial" w:cs="Arial"/>
+          <w:sz w:val="24"/>
+          <w:szCs w:val="24"/>
+        </w:rPr>
+      </w:pPr>
+      <w:r>
+        <w:rPr>
+          <w:rFonts w:ascii="Arial" w:hAnsi="Arial" w:cs="Arial"/>
+          <w:sz w:val="24"/>
+          <w:szCs w:val="24"/>
+        </w:rPr>
+        <w:t xml:space="preserve">05.27 </w:t>
       </w:r>
     </w:p>
     <w:p>
@@ -776,11 +793,11 @@
       <w:lang w:val="ca-ES"/>
     </w:rPr>
   </w:style>
-  <w:style w:type="paragraph" w:styleId="Ttulo1">
+  <w:style w:type="paragraph" w:styleId="Heading1">
     <w:name w:val="heading 1"/>
     <w:basedOn w:val="Normal"/>
     <w:next w:val="Normal"/>
-    <w:link w:val="Ttulo1Car"/>
+    <w:link w:val="Heading1Char"/>
     <w:uiPriority w:val="9"/>
     <w:qFormat/>
     <w:rsid w:val="00294030"/>
@@ -797,11 +814,11 @@
       <w:szCs w:val="40"/>
     </w:rPr>
   </w:style>
-  <w:style w:type="paragraph" w:styleId="Ttulo2">
+  <w:style w:type="paragraph" w:styleId="Heading2">
     <w:name w:val="heading 2"/>
     <w:basedOn w:val="Normal"/>
     <w:next w:val="Normal"/>
-    <w:link w:val="Ttulo2Car"/>
+    <w:link w:val="Heading2Char"/>
     <w:uiPriority w:val="9"/>
     <w:semiHidden/>
     <w:unhideWhenUsed/>
@@ -820,11 +837,11 @@
       <w:szCs w:val="32"/>
     </w:rPr>
   </w:style>
-  <w:style w:type="paragraph" w:styleId="Ttulo3">
+  <w:style w:type="paragraph" w:styleId="Heading3">
     <w:name w:val="heading 3"/>
     <w:basedOn w:val="Normal"/>
     <w:next w:val="Normal"/>
-    <w:link w:val="Ttulo3Car"/>
+    <w:link w:val="Heading3Char"/>
     <w:uiPriority w:val="9"/>
     <w:semiHidden/>
     <w:unhideWhenUsed/>
@@ -843,11 +860,11 @@
       <w:szCs w:val="28"/>
     </w:rPr>
   </w:style>
-  <w:style w:type="paragraph" w:styleId="Ttulo4">
+  <w:style w:type="paragraph" w:styleId="Heading4">
     <w:name w:val="heading 4"/>
     <w:basedOn w:val="Normal"/>
     <w:next w:val="Normal"/>
-    <w:link w:val="Ttulo4Car"/>
+    <w:link w:val="Heading4Char"/>
     <w:uiPriority w:val="9"/>
     <w:semiHidden/>
     <w:unhideWhenUsed/>
@@ -866,11 +883,11 @@
       <w:color w:val="0F4761" w:themeColor="accent1" w:themeShade="BF"/>
     </w:rPr>
   </w:style>
-  <w:style w:type="paragraph" w:styleId="Ttulo5">
+  <w:style w:type="paragraph" w:styleId="Heading5">
     <w:name w:val="heading 5"/>
     <w:basedOn w:val="Normal"/>
     <w:next w:val="Normal"/>
-    <w:link w:val="Ttulo5Car"/>
+    <w:link w:val="Heading5Char"/>
     <w:uiPriority w:val="9"/>
     <w:semiHidden/>
     <w:unhideWhenUsed/>
@@ -887,11 +904,11 @@
       <w:color w:val="0F4761" w:themeColor="accent1" w:themeShade="BF"/>
     </w:rPr>
   </w:style>
-  <w:style w:type="paragraph" w:styleId="Ttulo6">
+  <w:style w:type="paragraph" w:styleId="Heading6">
     <w:name w:val="heading 6"/>
     <w:basedOn w:val="Normal"/>
     <w:next w:val="Normal"/>
-    <w:link w:val="Ttulo6Car"/>
+    <w:link w:val="Heading6Char"/>
     <w:uiPriority w:val="9"/>
     <w:semiHidden/>
     <w:unhideWhenUsed/>
@@ -910,11 +927,11 @@
       <w:color w:val="595959" w:themeColor="text1" w:themeTint="A6"/>
     </w:rPr>
   </w:style>
-  <w:style w:type="paragraph" w:styleId="Ttulo7">
+  <w:style w:type="paragraph" w:styleId="Heading7">
     <w:name w:val="heading 7"/>
     <w:basedOn w:val="Normal"/>
     <w:next w:val="Normal"/>
-    <w:link w:val="Ttulo7Car"/>
+    <w:link w:val="Heading7Char"/>
     <w:uiPriority w:val="9"/>
     <w:semiHidden/>
     <w:unhideWhenUsed/>
@@ -931,11 +948,11 @@
       <w:color w:val="595959" w:themeColor="text1" w:themeTint="A6"/>
     </w:rPr>
   </w:style>
-  <w:style w:type="paragraph" w:styleId="Ttulo8">
+  <w:style w:type="paragraph" w:styleId="Heading8">
     <w:name w:val="heading 8"/>
     <w:basedOn w:val="Normal"/>
     <w:next w:val="Normal"/>
-    <w:link w:val="Ttulo8Car"/>
+    <w:link w:val="Heading8Char"/>
     <w:uiPriority w:val="9"/>
     <w:semiHidden/>
     <w:unhideWhenUsed/>
@@ -954,11 +971,11 @@
       <w:color w:val="272727" w:themeColor="text1" w:themeTint="D8"/>
     </w:rPr>
   </w:style>
-  <w:style w:type="paragraph" w:styleId="Ttulo9">
+  <w:style w:type="paragraph" w:styleId="Heading9">
     <w:name w:val="heading 9"/>
     <w:basedOn w:val="Normal"/>
     <w:next w:val="Normal"/>
-    <w:link w:val="Ttulo9Car"/>
+    <w:link w:val="Heading9Char"/>
     <w:uiPriority w:val="9"/>
     <w:semiHidden/>
     <w:unhideWhenUsed/>
@@ -975,13 +992,13 @@
       <w:color w:val="272727" w:themeColor="text1" w:themeTint="D8"/>
     </w:rPr>
   </w:style>
-  <w:style w:type="character" w:default="1" w:styleId="Fuentedeprrafopredeter">
+  <w:style w:type="character" w:default="1" w:styleId="DefaultParagraphFont">
     <w:name w:val="Default Paragraph Font"/>
     <w:uiPriority w:val="1"/>
     <w:semiHidden/>
     <w:unhideWhenUsed/>
   </w:style>
-  <w:style w:type="table" w:default="1" w:styleId="Tablanormal">
+  <w:style w:type="table" w:default="1" w:styleId="TableNormal">
     <w:name w:val="Normal Table"/>
     <w:uiPriority w:val="99"/>
     <w:semiHidden/>
@@ -996,16 +1013,16 @@
       </w:tblCellMar>
     </w:tblPr>
   </w:style>
-  <w:style w:type="numbering" w:default="1" w:styleId="Sinlista">
+  <w:style w:type="numbering" w:default="1" w:styleId="NoList">
     <w:name w:val="No List"/>
     <w:uiPriority w:val="99"/>
     <w:semiHidden/>
     <w:unhideWhenUsed/>
   </w:style>
-  <w:style w:type="character" w:customStyle="1" w:styleId="Ttulo1Car">
-    <w:name w:val="Título 1 Car"/>
-    <w:basedOn w:val="Fuentedeprrafopredeter"/>
-    <w:link w:val="Ttulo1"/>
+  <w:style w:type="character" w:customStyle="1" w:styleId="Heading1Char">
+    <w:name w:val="Heading 1 Char"/>
+    <w:basedOn w:val="DefaultParagraphFont"/>
+    <w:link w:val="Heading1"/>
     <w:uiPriority w:val="9"/>
     <w:rsid w:val="00294030"/>
     <w:rPr>
@@ -1016,10 +1033,10 @@
       <w:lang w:val="ca-ES"/>
     </w:rPr>
   </w:style>
-  <w:style w:type="character" w:customStyle="1" w:styleId="Ttulo2Car">
-    <w:name w:val="Título 2 Car"/>
-    <w:basedOn w:val="Fuentedeprrafopredeter"/>
-    <w:link w:val="Ttulo2"/>
+  <w:style w:type="character" w:customStyle="1" w:styleId="Heading2Char">
+    <w:name w:val="Heading 2 Char"/>
+    <w:basedOn w:val="DefaultParagraphFont"/>
+    <w:link w:val="Heading2"/>
     <w:uiPriority w:val="9"/>
     <w:semiHidden/>
     <w:rsid w:val="00294030"/>
@@ -1031,10 +1048,10 @@
       <w:lang w:val="ca-ES"/>
     </w:rPr>
   </w:style>
-  <w:style w:type="character" w:customStyle="1" w:styleId="Ttulo3Car">
-    <w:name w:val="Título 3 Car"/>
-    <w:basedOn w:val="Fuentedeprrafopredeter"/>
-    <w:link w:val="Ttulo3"/>
+  <w:style w:type="character" w:customStyle="1" w:styleId="Heading3Char">
+    <w:name w:val="Heading 3 Char"/>
+    <w:basedOn w:val="DefaultParagraphFont"/>
+    <w:link w:val="Heading3"/>
     <w:uiPriority w:val="9"/>
     <w:semiHidden/>
     <w:rsid w:val="00294030"/>
@@ -1046,10 +1063,10 @@
       <w:lang w:val="ca-ES"/>
     </w:rPr>
   </w:style>
-  <w:style w:type="character" w:customStyle="1" w:styleId="Ttulo4Car">
-    <w:name w:val="Título 4 Car"/>
-    <w:basedOn w:val="Fuentedeprrafopredeter"/>
-    <w:link w:val="Ttulo4"/>
+  <w:style w:type="character" w:customStyle="1" w:styleId="Heading4Char">
+    <w:name w:val="Heading 4 Char"/>
+    <w:basedOn w:val="DefaultParagraphFont"/>
+    <w:link w:val="Heading4"/>
     <w:uiPriority w:val="9"/>
     <w:semiHidden/>
     <w:rsid w:val="00294030"/>
@@ -1061,10 +1078,10 @@
       <w:lang w:val="ca-ES"/>
     </w:rPr>
   </w:style>
-  <w:style w:type="character" w:customStyle="1" w:styleId="Ttulo5Car">
-    <w:name w:val="Título 5 Car"/>
-    <w:basedOn w:val="Fuentedeprrafopredeter"/>
-    <w:link w:val="Ttulo5"/>
+  <w:style w:type="character" w:customStyle="1" w:styleId="Heading5Char">
+    <w:name w:val="Heading 5 Char"/>
+    <w:basedOn w:val="DefaultParagraphFont"/>
+    <w:link w:val="Heading5"/>
     <w:uiPriority w:val="9"/>
     <w:semiHidden/>
     <w:rsid w:val="00294030"/>
@@ -1074,10 +1091,10 @@
       <w:lang w:val="ca-ES"/>
     </w:rPr>
   </w:style>
-  <w:style w:type="character" w:customStyle="1" w:styleId="Ttulo6Car">
-    <w:name w:val="Título 6 Car"/>
-    <w:basedOn w:val="Fuentedeprrafopredeter"/>
-    <w:link w:val="Ttulo6"/>
+  <w:style w:type="character" w:customStyle="1" w:styleId="Heading6Char">
+    <w:name w:val="Heading 6 Char"/>
+    <w:basedOn w:val="DefaultParagraphFont"/>
+    <w:link w:val="Heading6"/>
     <w:uiPriority w:val="9"/>
     <w:semiHidden/>
     <w:rsid w:val="00294030"/>
@@ -1089,10 +1106,10 @@
       <w:lang w:val="ca-ES"/>
     </w:rPr>
   </w:style>
-  <w:style w:type="character" w:customStyle="1" w:styleId="Ttulo7Car">
-    <w:name w:val="Título 7 Car"/>
-    <w:basedOn w:val="Fuentedeprrafopredeter"/>
-    <w:link w:val="Ttulo7"/>
+  <w:style w:type="character" w:customStyle="1" w:styleId="Heading7Char">
+    <w:name w:val="Heading 7 Char"/>
+    <w:basedOn w:val="DefaultParagraphFont"/>
+    <w:link w:val="Heading7"/>
     <w:uiPriority w:val="9"/>
     <w:semiHidden/>
     <w:rsid w:val="00294030"/>
@@ -1102,10 +1119,10 @@
       <w:lang w:val="ca-ES"/>
     </w:rPr>
   </w:style>
-  <w:style w:type="character" w:customStyle="1" w:styleId="Ttulo8Car">
-    <w:name w:val="Título 8 Car"/>
-    <w:basedOn w:val="Fuentedeprrafopredeter"/>
-    <w:link w:val="Ttulo8"/>
+  <w:style w:type="character" w:customStyle="1" w:styleId="Heading8Char">
+    <w:name w:val="Heading 8 Char"/>
+    <w:basedOn w:val="DefaultParagraphFont"/>
+    <w:link w:val="Heading8"/>
     <w:uiPriority w:val="9"/>
     <w:semiHidden/>
     <w:rsid w:val="00294030"/>
@@ -1117,10 +1134,10 @@
       <w:lang w:val="ca-ES"/>
     </w:rPr>
   </w:style>
-  <w:style w:type="character" w:customStyle="1" w:styleId="Ttulo9Car">
-    <w:name w:val="Título 9 Car"/>
-    <w:basedOn w:val="Fuentedeprrafopredeter"/>
-    <w:link w:val="Ttulo9"/>
+  <w:style w:type="character" w:customStyle="1" w:styleId="Heading9Char">
+    <w:name w:val="Heading 9 Char"/>
+    <w:basedOn w:val="DefaultParagraphFont"/>
+    <w:link w:val="Heading9"/>
     <w:uiPriority w:val="9"/>
     <w:semiHidden/>
     <w:rsid w:val="00294030"/>
@@ -1130,11 +1147,11 @@
       <w:lang w:val="ca-ES"/>
     </w:rPr>
   </w:style>
-  <w:style w:type="paragraph" w:styleId="Ttulo">
+  <w:style w:type="paragraph" w:styleId="Title">
     <w:name w:val="Title"/>
     <w:basedOn w:val="Normal"/>
     <w:next w:val="Normal"/>
-    <w:link w:val="TtuloCar"/>
+    <w:link w:val="TitleChar"/>
     <w:uiPriority w:val="10"/>
     <w:qFormat/>
     <w:rsid w:val="00294030"/>
@@ -1150,10 +1167,10 @@
       <w:szCs w:val="56"/>
     </w:rPr>
   </w:style>
-  <w:style w:type="character" w:customStyle="1" w:styleId="TtuloCar">
-    <w:name w:val="Título Car"/>
-    <w:basedOn w:val="Fuentedeprrafopredeter"/>
-    <w:link w:val="Ttulo"/>
+  <w:style w:type="character" w:customStyle="1" w:styleId="TitleChar">
+    <w:name w:val="Title Char"/>
+    <w:basedOn w:val="DefaultParagraphFont"/>
+    <w:link w:val="Title"/>
     <w:uiPriority w:val="10"/>
     <w:rsid w:val="00294030"/>
     <w:rPr>
@@ -1165,11 +1182,11 @@
       <w:lang w:val="ca-ES"/>
     </w:rPr>
   </w:style>
-  <w:style w:type="paragraph" w:styleId="Subttulo">
+  <w:style w:type="paragraph" w:styleId="Subtitle">
     <w:name w:val="Subtitle"/>
     <w:basedOn w:val="Normal"/>
     <w:next w:val="Normal"/>
-    <w:link w:val="SubttuloCar"/>
+    <w:link w:val="SubtitleChar"/>
     <w:uiPriority w:val="11"/>
     <w:qFormat/>
     <w:rsid w:val="00294030"/>
@@ -1186,10 +1203,10 @@
       <w:szCs w:val="28"/>
     </w:rPr>
   </w:style>
-  <w:style w:type="character" w:customStyle="1" w:styleId="SubttuloCar">
-    <w:name w:val="Subtítulo Car"/>
-    <w:basedOn w:val="Fuentedeprrafopredeter"/>
-    <w:link w:val="Subttulo"/>
+  <w:style w:type="character" w:customStyle="1" w:styleId="SubtitleChar">
+    <w:name w:val="Subtitle Char"/>
+    <w:basedOn w:val="DefaultParagraphFont"/>
+    <w:link w:val="Subtitle"/>
     <w:uiPriority w:val="11"/>
     <w:rsid w:val="00294030"/>
     <w:rPr>
@@ -1201,11 +1218,11 @@
       <w:lang w:val="ca-ES"/>
     </w:rPr>
   </w:style>
-  <w:style w:type="paragraph" w:styleId="Cita">
+  <w:style w:type="paragraph" w:styleId="Quote">
     <w:name w:val="Quote"/>
     <w:basedOn w:val="Normal"/>
     <w:next w:val="Normal"/>
-    <w:link w:val="CitaCar"/>
+    <w:link w:val="QuoteChar"/>
     <w:uiPriority w:val="29"/>
     <w:qFormat/>
     <w:rsid w:val="00294030"/>
@@ -1219,10 +1236,10 @@
       <w:color w:val="404040" w:themeColor="text1" w:themeTint="BF"/>
     </w:rPr>
   </w:style>
-  <w:style w:type="character" w:customStyle="1" w:styleId="CitaCar">
-    <w:name w:val="Cita Car"/>
-    <w:basedOn w:val="Fuentedeprrafopredeter"/>
-    <w:link w:val="Cita"/>
+  <w:style w:type="character" w:customStyle="1" w:styleId="QuoteChar">
+    <w:name w:val="Quote Char"/>
+    <w:basedOn w:val="DefaultParagraphFont"/>
+    <w:link w:val="Quote"/>
     <w:uiPriority w:val="29"/>
     <w:rsid w:val="00294030"/>
     <w:rPr>
@@ -1232,7 +1249,7 @@
       <w:lang w:val="ca-ES"/>
     </w:rPr>
   </w:style>
-  <w:style w:type="paragraph" w:styleId="Prrafodelista">
+  <w:style w:type="paragraph" w:styleId="ListParagraph">
     <w:name w:val="List Paragraph"/>
     <w:basedOn w:val="Normal"/>
     <w:uiPriority w:val="34"/>
@@ -1243,9 +1260,9 @@
       <w:contextualSpacing/>
     </w:pPr>
   </w:style>
-  <w:style w:type="character" w:styleId="nfasisintenso">
+  <w:style w:type="character" w:styleId="IntenseEmphasis">
     <w:name w:val="Intense Emphasis"/>
-    <w:basedOn w:val="Fuentedeprrafopredeter"/>
+    <w:basedOn w:val="DefaultParagraphFont"/>
     <w:uiPriority w:val="21"/>
     <w:qFormat/>
     <w:rsid w:val="00294030"/>
@@ -1255,11 +1272,11 @@
       <w:color w:val="0F4761" w:themeColor="accent1" w:themeShade="BF"/>
     </w:rPr>
   </w:style>
-  <w:style w:type="paragraph" w:styleId="Citadestacada">
+  <w:style w:type="paragraph" w:styleId="IntenseQuote">
     <w:name w:val="Intense Quote"/>
     <w:basedOn w:val="Normal"/>
     <w:next w:val="Normal"/>
-    <w:link w:val="CitadestacadaCar"/>
+    <w:link w:val="IntenseQuoteChar"/>
     <w:uiPriority w:val="30"/>
     <w:qFormat/>
     <w:rsid w:val="00294030"/>
@@ -1278,10 +1295,10 @@
       <w:color w:val="0F4761" w:themeColor="accent1" w:themeShade="BF"/>
     </w:rPr>
   </w:style>
-  <w:style w:type="character" w:customStyle="1" w:styleId="CitadestacadaCar">
-    <w:name w:val="Cita destacada Car"/>
-    <w:basedOn w:val="Fuentedeprrafopredeter"/>
-    <w:link w:val="Citadestacada"/>
+  <w:style w:type="character" w:customStyle="1" w:styleId="IntenseQuoteChar">
+    <w:name w:val="Intense Quote Char"/>
+    <w:basedOn w:val="DefaultParagraphFont"/>
+    <w:link w:val="IntenseQuote"/>
     <w:uiPriority w:val="30"/>
     <w:rsid w:val="00294030"/>
     <w:rPr>
@@ -1291,9 +1308,9 @@
       <w:lang w:val="ca-ES"/>
     </w:rPr>
   </w:style>
-  <w:style w:type="character" w:styleId="Referenciaintensa">
+  <w:style w:type="character" w:styleId="IntenseReference">
     <w:name w:val="Intense Reference"/>
-    <w:basedOn w:val="Fuentedeprrafopredeter"/>
+    <w:basedOn w:val="DefaultParagraphFont"/>
     <w:uiPriority w:val="32"/>
     <w:qFormat/>
     <w:rsid w:val="00294030"/>

</xml_diff>

<commit_message>
Reorganize repo layout and document the data_validation workflow
Move documentation/ and idees/ under .docu/ and rename GTFS pipeline
stages 0_original -> 0_raw and 4_doors -> 4_doors_time so folder names
match the rest of the staged pipeline. Add data_validation/WORKFLOW.md
describing the end-to-end run order, and update the READMEs and
gtfs_utils.py constants/exports to match the new stage names.

Also extend read_header/parse_time_to_seconds in scripts/utils.py and
gtfs_utils.py to support the door-time pipeline (negative durations,
CSV header introspection), and adjust the L9_L10, between_platforms,
and processing scripts/notebooks accordingly.
</commit_message>
<xml_diff>
--- a/.meetings/Resum.docx
+++ b/.meetings/Resum.docx
@@ -1,6 +1,6 @@
 
 <file path=word/document.xml><?xml version="1.0" encoding="utf-8"?>
-<w:document xmlns:wpc="http://schemas.microsoft.com/office/word/2010/wordprocessingCanvas" xmlns:cx="http://schemas.microsoft.com/office/drawing/2014/chartex" xmlns:cx1="http://schemas.microsoft.com/office/drawing/2015/9/8/chartex" xmlns:cx2="http://schemas.microsoft.com/office/drawing/2015/10/21/chartex" xmlns:cx3="http://schemas.microsoft.com/office/drawing/2016/5/9/chartex" xmlns:cx4="http://schemas.microsoft.com/office/drawing/2016/5/10/chartex" xmlns:cx5="http://schemas.microsoft.com/office/drawing/2016/5/11/chartex" xmlns:cx6="http://schemas.microsoft.com/office/drawing/2016/5/12/chartex" xmlns:cx7="http://schemas.microsoft.com/office/drawing/2016/5/13/chartex" xmlns:cx8="http://schemas.microsoft.com/office/drawing/2016/5/14/chartex" xmlns:mc="http://schemas.openxmlformats.org/markup-compatibility/2006" xmlns:aink="http://schemas.microsoft.com/office/drawing/2016/ink" xmlns:am3d="http://schemas.microsoft.com/office/drawing/2017/model3d" xmlns:o="urn:schemas-microsoft-com:office:office" xmlns:oel="http://schemas.microsoft.com/office/2019/extlst" xmlns:r="http://schemas.openxmlformats.org/officeDocument/2006/relationships" xmlns:m="http://schemas.openxmlformats.org/officeDocument/2006/math" xmlns:v="urn:schemas-microsoft-com:vml" xmlns:wp14="http://schemas.microsoft.com/office/word/2010/wordprocessingDrawing" xmlns:wp="http://schemas.openxmlformats.org/drawingml/2006/wordprocessingDrawing" xmlns:w10="urn:schemas-microsoft-com:office:word" xmlns:w="http://schemas.openxmlformats.org/wordprocessingml/2006/main" xmlns:w14="http://schemas.microsoft.com/office/word/2010/wordml" xmlns:w15="http://schemas.microsoft.com/office/word/2012/wordml" xmlns:w16cex="http://schemas.microsoft.com/office/word/2018/wordml/cex" xmlns:w16cid="http://schemas.microsoft.com/office/word/2016/wordml/cid" xmlns:w16="http://schemas.microsoft.com/office/word/2018/wordml" xmlns:w16du="http://schemas.microsoft.com/office/word/2023/wordml/word16du" xmlns:w16sdtdh="http://schemas.microsoft.com/office/word/2020/wordml/sdtdatahash" xmlns:w16sdtfl="http://schemas.microsoft.com/office/word/2024/wordml/sdtformatlock" xmlns:w16se="http://schemas.microsoft.com/office/word/2015/wordml/symex" xmlns:wpg="http://schemas.microsoft.com/office/word/2010/wordprocessingGroup" xmlns:wpi="http://schemas.microsoft.com/office/word/2010/wordprocessingInk" xmlns:wne="http://schemas.microsoft.com/office/word/2006/wordml" xmlns:wps="http://schemas.microsoft.com/office/word/2010/wordprocessingShape" mc:Ignorable="w14 w15 w16se w16cid w16 w16cex w16sdtdh w16sdtfl w16du wp14">
+<w:document xmlns:wpc="http://schemas.microsoft.com/office/word/2010/wordprocessingCanvas" xmlns:cx="http://schemas.microsoft.com/office/drawing/2014/chartex" xmlns:cx1="http://schemas.microsoft.com/office/drawing/2015/9/8/chartex" xmlns:cx2="http://schemas.microsoft.com/office/drawing/2015/10/21/chartex" xmlns:cx3="http://schemas.microsoft.com/office/drawing/2016/5/9/chartex" xmlns:cx4="http://schemas.microsoft.com/office/drawing/2016/5/10/chartex" xmlns:cx5="http://schemas.microsoft.com/office/drawing/2016/5/11/chartex" xmlns:cx6="http://schemas.microsoft.com/office/drawing/2016/5/12/chartex" xmlns:cx7="http://schemas.microsoft.com/office/drawing/2016/5/13/chartex" xmlns:cx8="http://schemas.microsoft.com/office/drawing/2016/5/14/chartex" xmlns:mc="http://schemas.openxmlformats.org/markup-compatibility/2006" xmlns:m="http://schemas.openxmlformats.org/officeDocument/2006/math" xmlns:aink="http://schemas.microsoft.com/office/drawing/2016/ink" xmlns:am3d="http://schemas.microsoft.com/office/drawing/2017/model3d" xmlns:oel="http://schemas.microsoft.com/office/2019/extlst" xmlns:r="http://schemas.openxmlformats.org/officeDocument/2006/relationships" xmlns:wp14="http://schemas.microsoft.com/office/word/2010/wordprocessingDrawing" xmlns:wp="http://schemas.openxmlformats.org/drawingml/2006/wordprocessingDrawing" xmlns:wpg="http://schemas.microsoft.com/office/word/2010/wordprocessingGroup" xmlns:wpi="http://schemas.microsoft.com/office/word/2010/wordprocessingInk" xmlns:wps="http://schemas.microsoft.com/office/word/2010/wordprocessingShape" xmlns:o="urn:schemas-microsoft-com:office:office" xmlns:v="urn:schemas-microsoft-com:vml" xmlns:w10="urn:schemas-microsoft-com:office:word" xmlns:w="http://schemas.openxmlformats.org/wordprocessingml/2006/main" xmlns:w14="http://schemas.microsoft.com/office/word/2010/wordml" xmlns:w15="http://schemas.microsoft.com/office/word/2012/wordml" xmlns:w16cex="http://schemas.microsoft.com/office/word/2018/wordml/cex" xmlns:w16cid="http://schemas.microsoft.com/office/word/2016/wordml/cid" xmlns:w16="http://schemas.microsoft.com/office/word/2018/wordml" xmlns:w16sdtdh="http://schemas.microsoft.com/office/word/2020/wordml/sdtdatahash" xmlns:w16sdtfl="http://schemas.microsoft.com/office/word/2024/wordml/sdtformatlock" xmlns:w16se="http://schemas.microsoft.com/office/word/2015/wordml/symex" xmlns:w16du="http://schemas.microsoft.com/office/word/2023/wordml/word16du" xmlns:wne="http://schemas.microsoft.com/office/word/2006/wordml" mc:Ignorable="w14 w15 w16se w16cid w16 w16cex w16sdtdh w16sdtfl w16du wp14">
   <w:body>
     <w:p>
       <w:pPr>
@@ -375,42 +375,14 @@
           <w:sz w:val="24"/>
           <w:szCs w:val="24"/>
         </w:rPr>
-        <w:t xml:space="preserve">Hipòtesis i idees redactades, basics.py, </w:t>
-      </w:r>
-      <w:r>
-        <w:rPr>
-          <w:rFonts w:ascii="Arial" w:hAnsi="Arial" w:cs="Arial"/>
-        </w:rPr>
-        <w:t>L</w:t>
-      </w:r>
-      <w:r>
-        <w:rPr>
-          <w:rFonts w:ascii="Arial" w:hAnsi="Arial" w:cs="Arial"/>
-        </w:rPr>
-        <w:t>9_</w:t>
-      </w:r>
-      <w:r>
-        <w:rPr>
-          <w:rFonts w:ascii="Arial" w:hAnsi="Arial" w:cs="Arial"/>
-        </w:rPr>
-        <w:t>L</w:t>
-      </w:r>
-      <w:r>
-        <w:rPr>
-          <w:rFonts w:ascii="Arial" w:hAnsi="Arial" w:cs="Arial"/>
-        </w:rPr>
-        <w:t>10.py</w:t>
-      </w:r>
-      <w:r>
-        <w:rPr>
-          <w:rFonts w:ascii="Arial" w:hAnsi="Arial" w:cs="Arial"/>
-        </w:rPr>
-        <w:t xml:space="preserve">, </w:t>
+        <w:t xml:space="preserve">Hipòtesis i idees redactades, basics.py, L9_L10.py, </w:t>
       </w:r>
       <w:proofErr w:type="spellStart"/>
       <w:r>
         <w:rPr>
           <w:rFonts w:ascii="Arial" w:hAnsi="Arial" w:cs="Arial"/>
+          <w:sz w:val="24"/>
+          <w:szCs w:val="24"/>
         </w:rPr>
         <w:t>adonament</w:t>
       </w:r>
@@ -418,6 +390,8 @@
       <w:r>
         <w:rPr>
           <w:rFonts w:ascii="Arial" w:hAnsi="Arial" w:cs="Arial"/>
+          <w:sz w:val="24"/>
+          <w:szCs w:val="24"/>
         </w:rPr>
         <w:t xml:space="preserve"> que a ‘</w:t>
       </w:r>
@@ -425,6 +399,8 @@
       <w:r>
         <w:rPr>
           <w:rFonts w:ascii="Arial" w:hAnsi="Arial" w:cs="Arial"/>
+          <w:sz w:val="24"/>
+          <w:szCs w:val="24"/>
         </w:rPr>
         <w:t>stop_times</w:t>
       </w:r>
@@ -432,8 +408,156 @@
       <w:r>
         <w:rPr>
           <w:rFonts w:ascii="Arial" w:hAnsi="Arial" w:cs="Arial"/>
+          <w:sz w:val="24"/>
+          <w:szCs w:val="24"/>
         </w:rPr>
         <w:t>’ no sempre la seqüencia de parades és la correcta, pla futur L9 i L10...</w:t>
+      </w:r>
+    </w:p>
+    <w:p>
+      <w:pPr>
+        <w:rPr>
+          <w:rFonts w:ascii="Arial" w:hAnsi="Arial" w:cs="Arial"/>
+          <w:sz w:val="24"/>
+          <w:szCs w:val="24"/>
+        </w:rPr>
+      </w:pPr>
+      <w:r>
+        <w:rPr>
+          <w:rFonts w:ascii="Arial" w:hAnsi="Arial" w:cs="Arial"/>
+          <w:sz w:val="24"/>
+          <w:szCs w:val="24"/>
+        </w:rPr>
+        <w:t xml:space="preserve">06.08 </w:t>
+      </w:r>
+      <w:r>
+        <w:rPr>
+          <w:rFonts w:ascii="Arial" w:hAnsi="Arial" w:cs="Arial"/>
+          <w:sz w:val="24"/>
+          <w:szCs w:val="24"/>
+        </w:rPr>
+        <w:t xml:space="preserve">Nova estructura del mòdul </w:t>
+      </w:r>
+      <w:proofErr w:type="spellStart"/>
+      <w:r>
+        <w:rPr>
+          <w:rFonts w:ascii="Arial" w:hAnsi="Arial" w:cs="Arial"/>
+          <w:sz w:val="24"/>
+          <w:szCs w:val="24"/>
+        </w:rPr>
+        <w:t>data_validation</w:t>
+      </w:r>
+      <w:proofErr w:type="spellEnd"/>
+      <w:r>
+        <w:rPr>
+          <w:rFonts w:ascii="Arial" w:hAnsi="Arial" w:cs="Arial"/>
+          <w:sz w:val="24"/>
+          <w:szCs w:val="24"/>
+        </w:rPr>
+        <w:t xml:space="preserve"> amb passos clars i canvis de la mà amb la no</w:t>
+      </w:r>
+      <w:r>
+        <w:rPr>
+          <w:rFonts w:ascii="Arial" w:hAnsi="Arial" w:cs="Arial"/>
+          <w:sz w:val="24"/>
+          <w:szCs w:val="24"/>
+        </w:rPr>
+        <w:t>v</w:t>
+      </w:r>
+      <w:r>
+        <w:rPr>
+          <w:rFonts w:ascii="Arial" w:hAnsi="Arial" w:cs="Arial"/>
+          <w:sz w:val="24"/>
+          <w:szCs w:val="24"/>
+        </w:rPr>
+        <w:t xml:space="preserve">a estructura de </w:t>
+      </w:r>
+      <w:r>
+        <w:rPr>
+          <w:rFonts w:ascii="Arial" w:hAnsi="Arial" w:cs="Arial"/>
+          <w:sz w:val="24"/>
+          <w:szCs w:val="24"/>
+        </w:rPr>
+        <w:t>.</w:t>
+      </w:r>
+      <w:proofErr w:type="spellStart"/>
+      <w:r>
+        <w:rPr>
+          <w:rFonts w:ascii="Arial" w:hAnsi="Arial" w:cs="Arial"/>
+          <w:sz w:val="24"/>
+          <w:szCs w:val="24"/>
+        </w:rPr>
+        <w:t>src</w:t>
+      </w:r>
+      <w:proofErr w:type="spellEnd"/>
+      <w:r>
+        <w:rPr>
+          <w:rFonts w:ascii="Arial" w:hAnsi="Arial" w:cs="Arial"/>
+          <w:sz w:val="24"/>
+          <w:szCs w:val="24"/>
+        </w:rPr>
+        <w:t>/</w:t>
+      </w:r>
+      <w:proofErr w:type="spellStart"/>
+      <w:r>
+        <w:rPr>
+          <w:rFonts w:ascii="Arial" w:hAnsi="Arial" w:cs="Arial"/>
+          <w:sz w:val="24"/>
+          <w:szCs w:val="24"/>
+        </w:rPr>
+        <w:t>gtfs</w:t>
+      </w:r>
+      <w:proofErr w:type="spellEnd"/>
+      <w:r>
+        <w:rPr>
+          <w:rFonts w:ascii="Arial" w:hAnsi="Arial" w:cs="Arial"/>
+          <w:sz w:val="24"/>
+          <w:szCs w:val="24"/>
+        </w:rPr>
+        <w:t>/data</w:t>
+      </w:r>
+      <w:r>
+        <w:rPr>
+          <w:rFonts w:ascii="Arial" w:hAnsi="Arial" w:cs="Arial"/>
+          <w:sz w:val="24"/>
+          <w:szCs w:val="24"/>
+        </w:rPr>
+        <w:t>, nova documentació (</w:t>
+      </w:r>
+      <w:proofErr w:type="spellStart"/>
+      <w:r>
+        <w:rPr>
+          <w:rFonts w:ascii="Arial" w:hAnsi="Arial" w:cs="Arial"/>
+          <w:sz w:val="24"/>
+          <w:szCs w:val="24"/>
+        </w:rPr>
+        <w:t>readmes</w:t>
+      </w:r>
+      <w:proofErr w:type="spellEnd"/>
+      <w:r>
+        <w:rPr>
+          <w:rFonts w:ascii="Arial" w:hAnsi="Arial" w:cs="Arial"/>
+          <w:sz w:val="24"/>
+          <w:szCs w:val="24"/>
+        </w:rPr>
+        <w:t>, glossari, pesos i millora de ja existents)</w:t>
+      </w:r>
+    </w:p>
+    <w:p>
+      <w:pPr>
+        <w:rPr>
+          <w:rFonts w:ascii="Arial" w:hAnsi="Arial" w:cs="Arial"/>
+          <w:sz w:val="24"/>
+          <w:szCs w:val="24"/>
+        </w:rPr>
+      </w:pPr>
+      <w:r>
+        <w:rPr>
+          <w:rFonts w:ascii="Arial" w:hAnsi="Arial" w:cs="Arial"/>
+          <w:sz w:val="24"/>
+          <w:szCs w:val="24"/>
+        </w:rPr>
+        <w:t>06.25</w:t>
       </w:r>
     </w:p>
     <w:p>
@@ -456,7 +580,7 @@
 </file>
 
 <file path=word/styles.xml><?xml version="1.0" encoding="utf-8"?>
-<w:styles xmlns:mc="http://schemas.openxmlformats.org/markup-compatibility/2006" xmlns:r="http://schemas.openxmlformats.org/officeDocument/2006/relationships" xmlns:w="http://schemas.openxmlformats.org/wordprocessingml/2006/main" xmlns:w14="http://schemas.microsoft.com/office/word/2010/wordml" xmlns:w15="http://schemas.microsoft.com/office/word/2012/wordml" xmlns:w16cex="http://schemas.microsoft.com/office/word/2018/wordml/cex" xmlns:w16cid="http://schemas.microsoft.com/office/word/2016/wordml/cid" xmlns:w16="http://schemas.microsoft.com/office/word/2018/wordml" xmlns:w16du="http://schemas.microsoft.com/office/word/2023/wordml/word16du" xmlns:w16sdtdh="http://schemas.microsoft.com/office/word/2020/wordml/sdtdatahash" xmlns:w16sdtfl="http://schemas.microsoft.com/office/word/2024/wordml/sdtformatlock" xmlns:w16se="http://schemas.microsoft.com/office/word/2015/wordml/symex" mc:Ignorable="w14 w15 w16se w16cid w16 w16cex w16sdtdh w16sdtfl w16du">
+<w:styles xmlns:mc="http://schemas.openxmlformats.org/markup-compatibility/2006" xmlns:r="http://schemas.openxmlformats.org/officeDocument/2006/relationships" xmlns:w="http://schemas.openxmlformats.org/wordprocessingml/2006/main" xmlns:w14="http://schemas.microsoft.com/office/word/2010/wordml" xmlns:w15="http://schemas.microsoft.com/office/word/2012/wordml" xmlns:w16cex="http://schemas.microsoft.com/office/word/2018/wordml/cex" xmlns:w16cid="http://schemas.microsoft.com/office/word/2016/wordml/cid" xmlns:w16="http://schemas.microsoft.com/office/word/2018/wordml" xmlns:w16sdtdh="http://schemas.microsoft.com/office/word/2020/wordml/sdtdatahash" xmlns:w16sdtfl="http://schemas.microsoft.com/office/word/2024/wordml/sdtformatlock" xmlns:w16se="http://schemas.microsoft.com/office/word/2015/wordml/symex" xmlns:w16du="http://schemas.microsoft.com/office/word/2023/wordml/word16du" mc:Ignorable="w14 w15 w16se w16cid w16 w16cex w16sdtdh w16sdtfl w16du">
   <w:docDefaults>
     <w:rPrDefault>
       <w:rPr>

</xml_diff>

<commit_message>
refactor(data_validation): split stop_times_checks.ipynb into standalone scripts
- Replace checks/stop_times_checks.ipynb with checks/stop_times/, one script per check, numbered in pipeline run order
- Add sequence_increment_check.py (independent), 1_duplicate_trips_check.py, 2_canonical_sequence_check.py, 3_door_times_check.py, each runnable standalone and taking a `verify` arg to re-run after its paired processing step instead of detecting/writing fresh
- Print a brief explanation before each table/output in 3_door_times_check.py now that the markdown cells are gone
- Update WORKFLOW.md so each pipeline step is a literal shell command instead of a notebook cell to find and run
- Update README.md, checks/README.md, processing/README.md, and processing/3_stop_sequence.py docstring to reference the new scripts
</commit_message>
<xml_diff>
--- a/.meetings/Resum.docx
+++ b/.meetings/Resum.docx
@@ -470,15 +470,7 @@
           <w:sz w:val="24"/>
           <w:szCs w:val="24"/>
         </w:rPr>
-        <w:t xml:space="preserve">a estructura de </w:t>
-      </w:r>
-      <w:r>
-        <w:rPr>
-          <w:rFonts w:ascii="Arial" w:hAnsi="Arial" w:cs="Arial"/>
-          <w:sz w:val="24"/>
-          <w:szCs w:val="24"/>
-        </w:rPr>
-        <w:t>.</w:t>
+        <w:t>a estructura de .</w:t>
       </w:r>
       <w:proofErr w:type="spellStart"/>
       <w:r>
@@ -540,24 +532,191 @@
           <w:sz w:val="24"/>
           <w:szCs w:val="24"/>
         </w:rPr>
-        <w:t>, glossari, pesos i millora de ja existents)</w:t>
+        <w:t xml:space="preserve">, </w:t>
+      </w:r>
+      <w:r>
+        <w:rPr>
+          <w:rFonts w:ascii="Arial" w:hAnsi="Arial" w:cs="Arial"/>
+          <w:sz w:val="24"/>
+          <w:szCs w:val="24"/>
+        </w:rPr>
+        <w:t>glossari, pesos i millora de ja existents)</w:t>
       </w:r>
     </w:p>
     <w:p>
       <w:pPr>
-        <w:rPr>
-          <w:rFonts w:ascii="Arial" w:hAnsi="Arial" w:cs="Arial"/>
-          <w:sz w:val="24"/>
-          <w:szCs w:val="24"/>
-        </w:rPr>
-      </w:pPr>
-      <w:r>
-        <w:rPr>
-          <w:rFonts w:ascii="Arial" w:hAnsi="Arial" w:cs="Arial"/>
-          <w:sz w:val="24"/>
-          <w:szCs w:val="24"/>
-        </w:rPr>
-        <w:t>06.25</w:t>
+        <w:spacing w:line="278" w:lineRule="auto"/>
+        <w:rPr>
+          <w:rFonts w:ascii="Arial" w:hAnsi="Arial" w:cs="Arial"/>
+          <w:sz w:val="24"/>
+          <w:szCs w:val="24"/>
+        </w:rPr>
+      </w:pPr>
+      <w:r>
+        <w:rPr>
+          <w:rFonts w:ascii="Arial" w:hAnsi="Arial" w:cs="Arial"/>
+          <w:sz w:val="24"/>
+          <w:szCs w:val="24"/>
+        </w:rPr>
+        <w:t xml:space="preserve">06.25 Workflow.md, document precisió, </w:t>
+      </w:r>
+      <w:proofErr w:type="spellStart"/>
+      <w:r>
+        <w:rPr>
+          <w:rFonts w:ascii="Arial" w:hAnsi="Arial" w:cs="Arial"/>
+          <w:sz w:val="24"/>
+          <w:szCs w:val="24"/>
+        </w:rPr>
+        <w:t>directional_asymmetry</w:t>
+      </w:r>
+      <w:proofErr w:type="spellEnd"/>
+      <w:r>
+        <w:rPr>
+          <w:rFonts w:ascii="Arial" w:hAnsi="Arial" w:cs="Arial"/>
+          <w:sz w:val="24"/>
+          <w:szCs w:val="24"/>
+        </w:rPr>
+        <w:t xml:space="preserve"> i </w:t>
+      </w:r>
+      <w:proofErr w:type="spellStart"/>
+      <w:r>
+        <w:rPr>
+          <w:rFonts w:ascii="Arial" w:hAnsi="Arial" w:cs="Arial"/>
+          <w:sz w:val="24"/>
+          <w:szCs w:val="24"/>
+        </w:rPr>
+        <w:t>Shared_platforms</w:t>
+      </w:r>
+      <w:proofErr w:type="spellEnd"/>
+      <w:r>
+        <w:rPr>
+          <w:rFonts w:ascii="Arial" w:hAnsi="Arial" w:cs="Arial"/>
+          <w:sz w:val="24"/>
+          <w:szCs w:val="24"/>
+        </w:rPr>
+        <w:t xml:space="preserve"> escalable amb </w:t>
+      </w:r>
+      <w:proofErr w:type="spellStart"/>
+      <w:r>
+        <w:rPr>
+          <w:rFonts w:ascii="Arial" w:hAnsi="Arial" w:cs="Arial"/>
+          <w:sz w:val="24"/>
+          <w:szCs w:val="24"/>
+        </w:rPr>
+        <w:t>bugs</w:t>
+      </w:r>
+      <w:proofErr w:type="spellEnd"/>
+      <w:r>
+        <w:rPr>
+          <w:rFonts w:ascii="Arial" w:hAnsi="Arial" w:cs="Arial"/>
+          <w:sz w:val="24"/>
+          <w:szCs w:val="24"/>
+        </w:rPr>
+        <w:t xml:space="preserve"> resolts i més eficient, creació ‘</w:t>
+      </w:r>
+      <w:proofErr w:type="spellStart"/>
+      <w:r>
+        <w:rPr>
+          <w:rFonts w:ascii="Arial" w:hAnsi="Arial" w:cs="Arial"/>
+          <w:sz w:val="24"/>
+          <w:szCs w:val="24"/>
+        </w:rPr>
+        <w:t>data_validation</w:t>
+      </w:r>
+      <w:proofErr w:type="spellEnd"/>
+      <w:r>
+        <w:rPr>
+          <w:rFonts w:ascii="Arial" w:hAnsi="Arial" w:cs="Arial"/>
+          <w:sz w:val="24"/>
+          <w:szCs w:val="24"/>
+        </w:rPr>
+        <w:t>/</w:t>
+      </w:r>
+      <w:proofErr w:type="spellStart"/>
+      <w:r>
+        <w:rPr>
+          <w:rFonts w:ascii="Arial" w:hAnsi="Arial" w:cs="Arial"/>
+          <w:sz w:val="24"/>
+          <w:szCs w:val="24"/>
+        </w:rPr>
+        <w:t>processing</w:t>
+      </w:r>
+      <w:proofErr w:type="spellEnd"/>
+      <w:r>
+        <w:rPr>
+          <w:rFonts w:ascii="Arial" w:hAnsi="Arial" w:cs="Arial"/>
+          <w:sz w:val="24"/>
+          <w:szCs w:val="24"/>
+        </w:rPr>
+        <w:t>/5_shared_platforms_duplication.</w:t>
+      </w:r>
+      <w:r>
+        <w:rPr>
+          <w:rFonts w:ascii="Arial" w:hAnsi="Arial" w:cs="Arial"/>
+          <w:sz w:val="24"/>
+          <w:szCs w:val="24"/>
+        </w:rPr>
+        <w:t>py’, dades artificials aplicades a ‘</w:t>
+      </w:r>
+      <w:r>
+        <w:rPr>
+          <w:rFonts w:ascii="Arial" w:hAnsi="Arial" w:cs="Arial"/>
+          <w:sz w:val="24"/>
+          <w:szCs w:val="24"/>
+        </w:rPr>
+        <w:t>scripts/stops_report.py</w:t>
+      </w:r>
+      <w:r>
+        <w:rPr>
+          <w:rFonts w:ascii="Arial" w:hAnsi="Arial" w:cs="Arial"/>
+          <w:sz w:val="24"/>
+          <w:szCs w:val="24"/>
+        </w:rPr>
+        <w:t>’ i creació de ‘</w:t>
+      </w:r>
+      <w:proofErr w:type="spellStart"/>
+      <w:r>
+        <w:rPr>
+          <w:rFonts w:ascii="Arial" w:hAnsi="Arial" w:cs="Arial"/>
+          <w:sz w:val="24"/>
+          <w:szCs w:val="24"/>
+        </w:rPr>
+        <w:t>data_validation</w:t>
+      </w:r>
+      <w:proofErr w:type="spellEnd"/>
+      <w:r>
+        <w:rPr>
+          <w:rFonts w:ascii="Arial" w:hAnsi="Arial" w:cs="Arial"/>
+          <w:sz w:val="24"/>
+          <w:szCs w:val="24"/>
+        </w:rPr>
+        <w:t>/</w:t>
+      </w:r>
+      <w:proofErr w:type="spellStart"/>
+      <w:r>
+        <w:rPr>
+          <w:rFonts w:ascii="Arial" w:hAnsi="Arial" w:cs="Arial"/>
+          <w:sz w:val="24"/>
+          <w:szCs w:val="24"/>
+        </w:rPr>
+        <w:t>analysis</w:t>
+      </w:r>
+      <w:proofErr w:type="spellEnd"/>
+      <w:r>
+        <w:rPr>
+          <w:rFonts w:ascii="Arial" w:hAnsi="Arial" w:cs="Arial"/>
+          <w:sz w:val="24"/>
+          <w:szCs w:val="24"/>
+        </w:rPr>
+        <w:t>/edge_stdev.py</w:t>
+      </w:r>
+      <w:r>
+        <w:rPr>
+          <w:rFonts w:ascii="Arial" w:hAnsi="Arial" w:cs="Arial"/>
+          <w:sz w:val="24"/>
+          <w:szCs w:val="24"/>
+        </w:rPr>
+        <w:t>’</w:t>
       </w:r>
     </w:p>
     <w:p>
@@ -577,6 +736,126 @@
     </w:sectPr>
   </w:body>
 </w:document>
+</file>
+
+<file path=word/numbering.xml><?xml version="1.0" encoding="utf-8"?>
+<w:numbering xmlns:wpc="http://schemas.microsoft.com/office/word/2010/wordprocessingCanvas" xmlns:cx="http://schemas.microsoft.com/office/drawing/2014/chartex" xmlns:cx1="http://schemas.microsoft.com/office/drawing/2015/9/8/chartex" xmlns:cx2="http://schemas.microsoft.com/office/drawing/2015/10/21/chartex" xmlns:cx3="http://schemas.microsoft.com/office/drawing/2016/5/9/chartex" xmlns:cx4="http://schemas.microsoft.com/office/drawing/2016/5/10/chartex" xmlns:cx5="http://schemas.microsoft.com/office/drawing/2016/5/11/chartex" xmlns:cx6="http://schemas.microsoft.com/office/drawing/2016/5/12/chartex" xmlns:cx7="http://schemas.microsoft.com/office/drawing/2016/5/13/chartex" xmlns:cx8="http://schemas.microsoft.com/office/drawing/2016/5/14/chartex" xmlns:mc="http://schemas.openxmlformats.org/markup-compatibility/2006" xmlns:m="http://schemas.openxmlformats.org/officeDocument/2006/math" xmlns:aink="http://schemas.microsoft.com/office/drawing/2016/ink" xmlns:am3d="http://schemas.microsoft.com/office/drawing/2017/model3d" xmlns:oel="http://schemas.microsoft.com/office/2019/extlst" xmlns:r="http://schemas.openxmlformats.org/officeDocument/2006/relationships" xmlns:wp14="http://schemas.microsoft.com/office/word/2010/wordprocessingDrawing" xmlns:wp="http://schemas.openxmlformats.org/drawingml/2006/wordprocessingDrawing" xmlns:wpg="http://schemas.microsoft.com/office/word/2010/wordprocessingGroup" xmlns:wpi="http://schemas.microsoft.com/office/word/2010/wordprocessingInk" xmlns:wps="http://schemas.microsoft.com/office/word/2010/wordprocessingShape" xmlns:o="urn:schemas-microsoft-com:office:office" xmlns:v="urn:schemas-microsoft-com:vml" xmlns:w10="urn:schemas-microsoft-com:office:word" xmlns:w="http://schemas.openxmlformats.org/wordprocessingml/2006/main" xmlns:w14="http://schemas.microsoft.com/office/word/2010/wordml" xmlns:w15="http://schemas.microsoft.com/office/word/2012/wordml" xmlns:w16cex="http://schemas.microsoft.com/office/word/2018/wordml/cex" xmlns:w16cid="http://schemas.microsoft.com/office/word/2016/wordml/cid" xmlns:w16="http://schemas.microsoft.com/office/word/2018/wordml" xmlns:w16sdtdh="http://schemas.microsoft.com/office/word/2020/wordml/sdtdatahash" xmlns:w16sdtfl="http://schemas.microsoft.com/office/word/2024/wordml/sdtformatlock" xmlns:w16se="http://schemas.microsoft.com/office/word/2015/wordml/symex" xmlns:w16du="http://schemas.microsoft.com/office/word/2023/wordml/word16du" xmlns:wne="http://schemas.microsoft.com/office/word/2006/wordml" mc:Ignorable="w14 w15 w16se w16cid w16 w16cex w16sdtdh w16sdtfl w16du wp14">
+  <w:abstractNum w:abstractNumId="0" w15:restartNumberingAfterBreak="0">
+    <w:nsid w:val="558E6875"/>
+    <w:multiLevelType w:val="hybridMultilevel"/>
+    <w:tmpl w:val="42CAC892"/>
+    <w:lvl w:ilvl="0" w:tplc="70D642A0">
+      <w:numFmt w:val="bullet"/>
+      <w:lvlText w:val="-"/>
+      <w:lvlJc w:val="left"/>
+      <w:pPr>
+        <w:ind w:left="720" w:hanging="360"/>
+      </w:pPr>
+      <w:rPr>
+        <w:rFonts w:ascii="Arial" w:eastAsiaTheme="minorHAnsi" w:hAnsi="Arial" w:cs="Arial" w:hint="default"/>
+      </w:rPr>
+    </w:lvl>
+    <w:lvl w:ilvl="1" w:tplc="08090003">
+      <w:start w:val="1"/>
+      <w:numFmt w:val="bullet"/>
+      <w:lvlText w:val="o"/>
+      <w:lvlJc w:val="left"/>
+      <w:pPr>
+        <w:ind w:left="1440" w:hanging="360"/>
+      </w:pPr>
+      <w:rPr>
+        <w:rFonts w:ascii="Courier New" w:hAnsi="Courier New" w:cs="Courier New" w:hint="default"/>
+      </w:rPr>
+    </w:lvl>
+    <w:lvl w:ilvl="2" w:tplc="08090005" w:tentative="1">
+      <w:start w:val="1"/>
+      <w:numFmt w:val="bullet"/>
+      <w:lvlText w:val=""/>
+      <w:lvlJc w:val="left"/>
+      <w:pPr>
+        <w:ind w:left="2160" w:hanging="360"/>
+      </w:pPr>
+      <w:rPr>
+        <w:rFonts w:ascii="Wingdings" w:hAnsi="Wingdings" w:hint="default"/>
+      </w:rPr>
+    </w:lvl>
+    <w:lvl w:ilvl="3" w:tplc="08090001" w:tentative="1">
+      <w:start w:val="1"/>
+      <w:numFmt w:val="bullet"/>
+      <w:lvlText w:val=""/>
+      <w:lvlJc w:val="left"/>
+      <w:pPr>
+        <w:ind w:left="2880" w:hanging="360"/>
+      </w:pPr>
+      <w:rPr>
+        <w:rFonts w:ascii="Symbol" w:hAnsi="Symbol" w:hint="default"/>
+      </w:rPr>
+    </w:lvl>
+    <w:lvl w:ilvl="4" w:tplc="08090003" w:tentative="1">
+      <w:start w:val="1"/>
+      <w:numFmt w:val="bullet"/>
+      <w:lvlText w:val="o"/>
+      <w:lvlJc w:val="left"/>
+      <w:pPr>
+        <w:ind w:left="3600" w:hanging="360"/>
+      </w:pPr>
+      <w:rPr>
+        <w:rFonts w:ascii="Courier New" w:hAnsi="Courier New" w:cs="Courier New" w:hint="default"/>
+      </w:rPr>
+    </w:lvl>
+    <w:lvl w:ilvl="5" w:tplc="08090005" w:tentative="1">
+      <w:start w:val="1"/>
+      <w:numFmt w:val="bullet"/>
+      <w:lvlText w:val=""/>
+      <w:lvlJc w:val="left"/>
+      <w:pPr>
+        <w:ind w:left="4320" w:hanging="360"/>
+      </w:pPr>
+      <w:rPr>
+        <w:rFonts w:ascii="Wingdings" w:hAnsi="Wingdings" w:hint="default"/>
+      </w:rPr>
+    </w:lvl>
+    <w:lvl w:ilvl="6" w:tplc="08090001" w:tentative="1">
+      <w:start w:val="1"/>
+      <w:numFmt w:val="bullet"/>
+      <w:lvlText w:val=""/>
+      <w:lvlJc w:val="left"/>
+      <w:pPr>
+        <w:ind w:left="5040" w:hanging="360"/>
+      </w:pPr>
+      <w:rPr>
+        <w:rFonts w:ascii="Symbol" w:hAnsi="Symbol" w:hint="default"/>
+      </w:rPr>
+    </w:lvl>
+    <w:lvl w:ilvl="7" w:tplc="08090003" w:tentative="1">
+      <w:start w:val="1"/>
+      <w:numFmt w:val="bullet"/>
+      <w:lvlText w:val="o"/>
+      <w:lvlJc w:val="left"/>
+      <w:pPr>
+        <w:ind w:left="5760" w:hanging="360"/>
+      </w:pPr>
+      <w:rPr>
+        <w:rFonts w:ascii="Courier New" w:hAnsi="Courier New" w:cs="Courier New" w:hint="default"/>
+      </w:rPr>
+    </w:lvl>
+    <w:lvl w:ilvl="8" w:tplc="08090005" w:tentative="1">
+      <w:start w:val="1"/>
+      <w:numFmt w:val="bullet"/>
+      <w:lvlText w:val=""/>
+      <w:lvlJc w:val="left"/>
+      <w:pPr>
+        <w:ind w:left="6480" w:hanging="360"/>
+      </w:pPr>
+      <w:rPr>
+        <w:rFonts w:ascii="Wingdings" w:hAnsi="Wingdings" w:hint="default"/>
+      </w:rPr>
+    </w:lvl>
+  </w:abstractNum>
+  <w:num w:numId="1" w16cid:durableId="1037968567">
+    <w:abstractNumId w:val="0"/>
+  </w:num>
+</w:numbering>
 </file>
 
 <file path=word/styles.xml><?xml version="1.0" encoding="utf-8"?>

</xml_diff>